<commit_message>
Release 1.31.0 — Fix Tender Document Rs./amount-wrap bugs, add Paper theme with Dashboard infographics
Co-Authored-By: Claude Sonnet 5 <noreply@anthropic.com>
</commit_message>
<xml_diff>
--- a/resources/civil-tender-template-header2.docx
+++ b/resources/civil-tender-template-header2.docx
@@ -1044,23 +1044,6 @@
                 <w:szCs w:val="22"/>
               </w:rPr>
               <w:t xml:space="preserve">Rs.  </w:t>
-            </w:r>
-          </w:p>
-          <w:p>
-            <w:pPr>
-              <w:pStyle w:val="Normal"/>
-              <w:rPr>
-                <w:b/>
-                <w:sz w:val="16"/>
-                <w:szCs w:val="16"/>
-              </w:rPr>
-            </w:pPr>
-            <w:r>
-              <w:rPr>
-                <w:b/>
-                <w:sz w:val="16"/>
-                <w:szCs w:val="16"/>
-              </w:rPr>
             </w:r>
             <w:r>
               <w:rPr>

</xml_diff>

<commit_message>
Release 1.32.0 — Fix hidden-row Excel counting, NIT No. trailing comma, Telugu PDF-export garbling, and letterhead print/font-rendering fixes
Co-Authored-By: Claude Sonnet 5 <noreply@anthropic.com>
</commit_message>
<xml_diff>
--- a/resources/civil-tender-template-header2.docx
+++ b/resources/civil-tender-template-header2.docx
@@ -113,7 +113,7 @@
             </w:r>
             <w:r>
               <w:rPr>
-                <w:rFonts w:ascii="Noto Sans Telugu" w:hAnsi="Noto Sans Telugu" w:cs="Noto Sans Telugu"/>
+                <w:rFonts w:cs="Gautami"/>
                 <w:color w:val="009EC6"/>
                 <w:sz w:val="48"/>
                 <w:szCs w:val="44"/>
@@ -2191,7 +2191,7 @@
             </w:r>
             <w:r>
               <w:rPr>
-                <w:rFonts w:ascii="Noto Sans Telugu" w:hAnsi="Noto Sans Telugu" w:cs="Noto Sans Telugu"/>
+                <w:rFonts w:cs="Gautami"/>
                 <w:color w:val="009EC6"/>
                 <w:sz w:val="48"/>
                 <w:szCs w:val="44"/>

</xml_diff>